<commit_message>
feat(onboarding): add optional work experience section to resume template
</commit_message>
<xml_diff>
--- a/public/templates/SmarTern_Student_Resume_Template.docx
+++ b/public/templates/SmarTern_Student_Resume_Template.docx
@@ -237,6 +237,84 @@
                 <w:i/>
               </w:rPr>
               <w:t>Expected Graduation – [Year, e.g., 2025]</w:t>
+            </w:r>
+          </w:p>
+          <w:p>
+            <w:pPr>
+              <w:keepNext/>
+              <w:spacing w:before="240" w:after="120"/>
+              <w:pBdr>
+                <w:bottom w:val="single" w:sz="4" w:space="1" w:color="CCCCCC"/>
+              </w:pBdr>
+            </w:pPr>
+            <w:r>
+              <w:rPr>
+                <w:b/>
+                <w:color w:val="0B5694"/>
+                <w:sz w:val="25"/>
+              </w:rPr>
+              <w:t>Work Experience (Optional)</w:t>
+            </w:r>
+          </w:p>
+          <w:p>
+            <w:pPr>
+              <w:spacing w:after="40"/>
+            </w:pPr>
+            <w:r>
+              <w:rPr>
+                <w:b/>
+                <w:sz w:val="20"/>
+              </w:rPr>
+              <w:t>[Job Title / Position, e.g., Web Developer Intern]</w:t>
+            </w:r>
+          </w:p>
+          <w:p>
+            <w:pPr>
+              <w:spacing w:after="40"/>
+            </w:pPr>
+            <w:r>
+              <w:rPr>
+                <w:b/>
+                <w:color w:val="505050"/>
+              </w:rPr>
+              <w:t>[Company / Organization Name, e.g., Tech Solutions Inc.]</w:t>
+            </w:r>
+          </w:p>
+          <w:p>
+            <w:pPr>
+              <w:spacing w:after="40"/>
+            </w:pPr>
+            <w:r>
+              <w:t>[Location, e.g., Makati City, Philippines]</w:t>
+            </w:r>
+          </w:p>
+          <w:p>
+            <w:pPr>
+              <w:spacing w:after="80"/>
+            </w:pPr>
+            <w:r>
+              <w:rPr>
+                <w:i/>
+              </w:rPr>
+              <w:t>[Inclusive Dates, e.g., June 2024 – August 2024]</w:t>
+            </w:r>
+          </w:p>
+          <w:p>
+            <w:pPr>
+              <w:pStyle w:val="ListBullet"/>
+              <w:spacing w:after="40"/>
+            </w:pPr>
+            <w:r>
+              <w:t>[Describe key responsibility or achievement, e.g., Developed responsive user interface components using Alpine.js and Tailwind CSS]</w:t>
+            </w:r>
+          </w:p>
+          <w:p>
+            <w:pPr>
+              <w:pStyle w:val="ListBullet"/>
+              <w:spacing w:after="240"/>
+            </w:pPr>
+            <w:r>
+              <w:t>[Describe another responsibility or achievement, e.g., Collaborated with backend team to integrate RESTful API endpoints]</w:t>
             </w:r>
           </w:p>
           <w:p>

</xml_diff>

<commit_message>
feat(onboarding): optimize resume template layout and spacing to fit exactly on one page
</commit_message>
<xml_diff>
--- a/public/templates/SmarTern_Student_Resume_Template.docx
+++ b/public/templates/SmarTern_Student_Resume_Template.docx
@@ -18,13 +18,13 @@
         </w:tblBorders>
       </w:tblPr>
       <w:tblGrid>
-        <w:gridCol w:w="2160"/>
-        <w:gridCol w:w="8352"/>
+        <w:gridCol w:w="1728"/>
+        <w:gridCol w:w="9072"/>
       </w:tblGrid>
       <w:tr>
         <w:tc>
           <w:tcPr>
-            <w:tcW w:type="dxa" w:w="2160"/>
+            <w:tcW w:type="dxa" w:w="1728"/>
             <w:tcBorders>
               <w:top w:val="single" w:sz="4" w:space="0" w:color="CCCCCC"/>
               <w:left w:val="single" w:sz="4" w:space="0" w:color="CCCCCC"/>
@@ -34,14 +34,14 @@
           </w:tcPr>
           <w:p>
             <w:pPr>
-              <w:spacing w:before="400" w:after="400"/>
+              <w:spacing w:before="80" w:after="80"/>
               <w:jc w:val="center"/>
             </w:pPr>
             <w:r>
               <w:rPr>
                 <w:b/>
                 <w:color w:val="787878"/>
-                <w:sz w:val="18"/>
+                <w:sz w:val="16"/>
               </w:rPr>
               <w:t>[ INSERT</w:t>
               <w:br/>
@@ -53,18 +53,18 @@
         </w:tc>
         <w:tc>
           <w:tcPr>
-            <w:tcW w:type="dxa" w:w="8352"/>
+            <w:tcW w:type="dxa" w:w="9072"/>
           </w:tcPr>
           <w:p>
             <w:pPr>
-              <w:spacing w:before="200" w:after="80"/>
-              <w:ind w:left="288"/>
+              <w:spacing w:before="80" w:after="40"/>
+              <w:ind w:left="216"/>
             </w:pPr>
             <w:r>
               <w:rPr>
                 <w:b/>
                 <w:color w:val="0B5694"/>
-                <w:sz w:val="40"/>
+                <w:sz w:val="32"/>
               </w:rPr>
               <w:t>[YOUR FULL NAME]</w:t>
             </w:r>
@@ -72,12 +72,12 @@
           <w:p>
             <w:pPr>
               <w:spacing w:before="0" w:after="0"/>
-              <w:ind w:left="288"/>
+              <w:ind w:left="216"/>
             </w:pPr>
             <w:r>
               <w:rPr>
                 <w:color w:val="505050"/>
-                <w:sz w:val="22"/>
+                <w:sz w:val="20"/>
               </w:rPr>
               <w:t>[YOUR DEGREE / PROGRAM, e.g., Bachelor of Science in Information Technology]</w:t>
             </w:r>
@@ -87,7 +87,7 @@
     </w:tbl>
     <w:p>
       <w:pPr>
-        <w:spacing w:before="240" w:after="240"/>
+        <w:spacing w:before="80" w:after="160"/>
         <w:pBdr>
           <w:bottom w:val="single" w:sz="6" w:space="1" w:color="0B5694"/>
         </w:pBdr>
@@ -109,18 +109,18 @@
         </w:tblBorders>
       </w:tblPr>
       <w:tblGrid>
-        <w:gridCol w:w="6480"/>
+        <w:gridCol w:w="6768"/>
         <w:gridCol w:w="4032"/>
       </w:tblGrid>
       <w:tr>
         <w:tc>
           <w:tcPr>
-            <w:tcW w:type="dxa" w:w="6480"/>
+            <w:tcW w:type="dxa" w:w="6768"/>
           </w:tcPr>
           <w:p>
             <w:pPr>
               <w:keepNext/>
-              <w:spacing w:before="240" w:after="120"/>
+              <w:spacing w:before="160" w:after="80"/>
               <w:pBdr>
                 <w:bottom w:val="single" w:sz="4" w:space="1" w:color="CCCCCC"/>
               </w:pBdr>
@@ -129,14 +129,14 @@
               <w:rPr>
                 <w:b/>
                 <w:color w:val="0B5694"/>
-                <w:sz w:val="25"/>
+                <w:sz w:val="22"/>
               </w:rPr>
               <w:t>Contact Information</w:t>
             </w:r>
           </w:p>
           <w:p>
             <w:pPr>
-              <w:spacing w:after="40"/>
+              <w:spacing w:after="20"/>
             </w:pPr>
             <w:r>
               <w:rPr>
@@ -151,7 +151,7 @@
           </w:p>
           <w:p>
             <w:pPr>
-              <w:spacing w:after="40"/>
+              <w:spacing w:after="20"/>
             </w:pPr>
             <w:r>
               <w:rPr>
@@ -166,7 +166,7 @@
           </w:p>
           <w:p>
             <w:pPr>
-              <w:spacing w:after="240"/>
+              <w:spacing w:after="160"/>
             </w:pPr>
             <w:r>
               <w:rPr>
@@ -182,7 +182,7 @@
           <w:p>
             <w:pPr>
               <w:keepNext/>
-              <w:spacing w:before="240" w:after="120"/>
+              <w:spacing w:before="160" w:after="80"/>
               <w:pBdr>
                 <w:bottom w:val="single" w:sz="4" w:space="1" w:color="CCCCCC"/>
               </w:pBdr>
@@ -191,26 +191,26 @@
               <w:rPr>
                 <w:b/>
                 <w:color w:val="0B5694"/>
-                <w:sz w:val="25"/>
+                <w:sz w:val="22"/>
               </w:rPr>
               <w:t>Education</w:t>
             </w:r>
           </w:p>
           <w:p>
             <w:pPr>
-              <w:spacing w:after="40"/>
+              <w:spacing w:after="20"/>
             </w:pPr>
             <w:r>
               <w:rPr>
                 <w:b/>
-                <w:sz w:val="20"/>
+                <w:sz w:val="19"/>
               </w:rPr>
               <w:t>[DEGREE / PROGRAM DETAILS, e.g., BS in Information Technology]</w:t>
             </w:r>
           </w:p>
           <w:p>
             <w:pPr>
-              <w:spacing w:after="40"/>
+              <w:spacing w:after="20"/>
             </w:pPr>
             <w:r>
               <w:rPr>
@@ -222,7 +222,7 @@
           </w:p>
           <w:p>
             <w:pPr>
-              <w:spacing w:after="40"/>
+              <w:spacing w:after="20"/>
             </w:pPr>
             <w:r>
               <w:t>[CAMPUS LOCATION, e.g., P. Paredes St., Sampaloc, Manila]</w:t>
@@ -230,7 +230,7 @@
           </w:p>
           <w:p>
             <w:pPr>
-              <w:spacing w:after="240"/>
+              <w:spacing w:after="160"/>
             </w:pPr>
             <w:r>
               <w:rPr>
@@ -242,7 +242,7 @@
           <w:p>
             <w:pPr>
               <w:keepNext/>
-              <w:spacing w:before="240" w:after="120"/>
+              <w:spacing w:before="160" w:after="80"/>
               <w:pBdr>
                 <w:bottom w:val="single" w:sz="4" w:space="1" w:color="CCCCCC"/>
               </w:pBdr>
@@ -251,26 +251,26 @@
               <w:rPr>
                 <w:b/>
                 <w:color w:val="0B5694"/>
-                <w:sz w:val="25"/>
+                <w:sz w:val="22"/>
               </w:rPr>
               <w:t>Work Experience (Optional)</w:t>
             </w:r>
           </w:p>
           <w:p>
             <w:pPr>
-              <w:spacing w:after="40"/>
+              <w:spacing w:after="20"/>
             </w:pPr>
             <w:r>
               <w:rPr>
                 <w:b/>
-                <w:sz w:val="20"/>
+                <w:sz w:val="19"/>
               </w:rPr>
               <w:t>[Job Title / Position, e.g., Web Developer Intern]</w:t>
             </w:r>
           </w:p>
           <w:p>
             <w:pPr>
-              <w:spacing w:after="40"/>
+              <w:spacing w:after="20"/>
             </w:pPr>
             <w:r>
               <w:rPr>
@@ -282,45 +282,40 @@
           </w:p>
           <w:p>
             <w:pPr>
-              <w:spacing w:after="40"/>
-            </w:pPr>
-            <w:r>
-              <w:t>[Location, e.g., Makati City, Philippines]</w:t>
-            </w:r>
-          </w:p>
-          <w:p>
-            <w:pPr>
-              <w:spacing w:after="80"/>
+              <w:spacing w:after="20"/>
             </w:pPr>
             <w:r>
               <w:rPr>
                 <w:i/>
               </w:rPr>
-              <w:t>[Inclusive Dates, e.g., June 2024 – August 2024]</w:t>
+              <w:t xml:space="preserve">[Inclusive Dates, e.g., June 2024 – August 2024] | </w:t>
+            </w:r>
+            <w:r>
+              <w:t>[Location, e.g., Makati City]</w:t>
             </w:r>
           </w:p>
           <w:p>
             <w:pPr>
               <w:pStyle w:val="ListBullet"/>
-              <w:spacing w:after="40"/>
+              <w:spacing w:after="20"/>
             </w:pPr>
             <w:r>
-              <w:t>[Describe key responsibility or achievement, e.g., Developed responsive user interface components using Alpine.js and Tailwind CSS]</w:t>
+              <w:t>[Describe responsibility/achievement, e.g., Developed responsive UI components using Alpine.js]</w:t>
             </w:r>
           </w:p>
           <w:p>
             <w:pPr>
               <w:pStyle w:val="ListBullet"/>
-              <w:spacing w:after="240"/>
+              <w:spacing w:after="160"/>
             </w:pPr>
             <w:r>
-              <w:t>[Describe another responsibility or achievement, e.g., Collaborated with backend team to integrate RESTful API endpoints]</w:t>
+              <w:t>[Describe another achievement, e.g., Integrated RESTful API endpoints with Laravel backend]</w:t>
             </w:r>
           </w:p>
           <w:p>
             <w:pPr>
               <w:keepNext/>
-              <w:spacing w:before="240" w:after="120"/>
+              <w:spacing w:before="160" w:after="80"/>
               <w:pBdr>
                 <w:bottom w:val="single" w:sz="4" w:space="1" w:color="CCCCCC"/>
               </w:pBdr>
@@ -329,14 +324,14 @@
               <w:rPr>
                 <w:b/>
                 <w:color w:val="0B5694"/>
-                <w:sz w:val="25"/>
+                <w:sz w:val="22"/>
               </w:rPr>
               <w:t>Key Skills / Proficiency</w:t>
             </w:r>
           </w:p>
           <w:p>
             <w:pPr>
-              <w:spacing w:before="80" w:after="60"/>
+              <w:spacing w:after="40"/>
             </w:pPr>
             <w:r>
               <w:rPr>
@@ -348,7 +343,7 @@
           <w:p>
             <w:pPr>
               <w:pStyle w:val="ListBullet"/>
-              <w:spacing w:after="40"/>
+              <w:spacing w:after="20"/>
             </w:pPr>
             <w:r>
               <w:rPr>
@@ -357,7 +352,22 @@
               <w:t xml:space="preserve">Programming Languages | </w:t>
             </w:r>
             <w:r>
-              <w:t>[e.g., HTML, JavaScript, Kotlin, PHP, Python]</w:t>
+              <w:t>HTML, JavaScript, Kotlin, PHP, Python</w:t>
+            </w:r>
+          </w:p>
+          <w:p>
+            <w:pPr>
+              <w:pStyle w:val="ListBullet"/>
+              <w:spacing w:after="20"/>
+            </w:pPr>
+            <w:r>
+              <w:rPr>
+                <w:b/>
+              </w:rPr>
+              <w:t xml:space="preserve">Database &amp; Dev Tools | </w:t>
+            </w:r>
+            <w:r>
+              <w:t>SQL, Git, Azure, AWS</w:t>
             </w:r>
           </w:p>
           <w:p>
@@ -366,51 +376,12 @@
               <w:spacing w:after="40"/>
             </w:pPr>
             <w:r>
-              <w:rPr>
-                <w:b/>
-              </w:rPr>
-              <w:t xml:space="preserve">Database | </w:t>
-            </w:r>
-            <w:r>
-              <w:t>[e.g., SQL, MySQL, PostgreSQL]</w:t>
+              <w:t>UI/UX Design &amp; Prototyping (Figma)</w:t>
             </w:r>
           </w:p>
           <w:p>
             <w:pPr>
-              <w:pStyle w:val="ListBullet"/>
               <w:spacing w:after="40"/>
-            </w:pPr>
-            <w:r>
-              <w:t>[Core Competency 1, e.g., UI/UX Design &amp; Prototyping]</w:t>
-            </w:r>
-          </w:p>
-          <w:p>
-            <w:pPr>
-              <w:pStyle w:val="ListBullet"/>
-              <w:spacing w:after="40"/>
-            </w:pPr>
-            <w:r>
-              <w:t>[Core Competency 2, e.g., API Development &amp; Integration]</w:t>
-            </w:r>
-          </w:p>
-          <w:p>
-            <w:pPr>
-              <w:pStyle w:val="ListBullet"/>
-              <w:spacing w:after="80"/>
-            </w:pPr>
-            <w:r>
-              <w:rPr>
-                <w:b/>
-              </w:rPr>
-              <w:t xml:space="preserve">Cloud Platform &amp; Dev Tools | </w:t>
-            </w:r>
-            <w:r>
-              <w:t>[e.g., Git, Azure, AWS]</w:t>
-            </w:r>
-          </w:p>
-          <w:p>
-            <w:pPr>
-              <w:spacing w:before="80" w:after="60"/>
             </w:pPr>
             <w:r>
               <w:rPr>
@@ -422,34 +393,25 @@
           <w:p>
             <w:pPr>
               <w:pStyle w:val="ListBullet"/>
-              <w:spacing w:after="40"/>
+              <w:spacing w:after="20"/>
             </w:pPr>
             <w:r>
-              <w:t>[Soft Skill 1, e.g., Oral and written communication]</w:t>
+              <w:t>Oral and written communication</w:t>
             </w:r>
           </w:p>
           <w:p>
             <w:pPr>
               <w:pStyle w:val="ListBullet"/>
-              <w:spacing w:after="40"/>
+              <w:spacing w:after="160"/>
             </w:pPr>
             <w:r>
-              <w:t>[Soft Skill 2, e.g., Teamwork &amp; Collaboration]</w:t>
-            </w:r>
-          </w:p>
-          <w:p>
-            <w:pPr>
-              <w:pStyle w:val="ListBullet"/>
-              <w:spacing w:after="240"/>
-            </w:pPr>
-            <w:r>
-              <w:t>[Soft Skill 3, e.g., Critical Thinking]</w:t>
+              <w:t>Teamwork &amp; Collaboration</w:t>
             </w:r>
           </w:p>
           <w:p>
             <w:pPr>
               <w:keepNext/>
-              <w:spacing w:before="240" w:after="120"/>
+              <w:spacing w:before="160" w:after="80"/>
               <w:pBdr>
                 <w:bottom w:val="single" w:sz="4" w:space="1" w:color="CCCCCC"/>
               </w:pBdr>
@@ -458,7 +420,7 @@
               <w:rPr>
                 <w:b/>
                 <w:color w:val="0B5694"/>
-                <w:sz w:val="25"/>
+                <w:sz w:val="22"/>
               </w:rPr>
               <w:t>Accomplished Projects / Engagements</w:t>
             </w:r>
@@ -466,7 +428,7 @@
           <w:p>
             <w:pPr>
               <w:pStyle w:val="ListBullet"/>
-              <w:spacing w:after="80"/>
+              <w:spacing w:after="60"/>
             </w:pPr>
             <w:r>
               <w:rPr>
@@ -475,34 +437,13 @@
               <w:t>[Project Title 1]</w:t>
             </w:r>
             <w:r>
-              <w:t xml:space="preserve"> : [Description of web/mobile system or research project] | </w:t>
+              <w:t xml:space="preserve"> : [Description of web/mobile system project] | </w:t>
             </w:r>
             <w:r>
               <w:rPr>
                 <w:i/>
               </w:rPr>
-              <w:t>[Your Role, e.g., Lead Developer]</w:t>
-            </w:r>
-          </w:p>
-          <w:p>
-            <w:pPr>
-              <w:pStyle w:val="ListBullet"/>
-              <w:spacing w:after="80"/>
-            </w:pPr>
-            <w:r>
-              <w:rPr>
-                <w:b/>
-              </w:rPr>
-              <w:t>[Project Title 2]</w:t>
-            </w:r>
-            <w:r>
-              <w:t xml:space="preserve"> : [Description of a seminar, organization project or activity] | </w:t>
-            </w:r>
-            <w:r>
-              <w:rPr>
-                <w:i/>
-              </w:rPr>
-              <w:t>[Your Role, e.g., Organizer]</w:t>
+              <w:t>[Role, e.g., Lead Developer]</w:t>
             </w:r>
           </w:p>
           <w:p>
@@ -514,7 +455,7 @@
               <w:rPr>
                 <w:b/>
               </w:rPr>
-              <w:t>[Project Title 3]</w:t>
+              <w:t>[Project Title 2]</w:t>
             </w:r>
             <w:r>
               <w:t xml:space="preserve"> : [Description of programming course project] | </w:t>
@@ -523,7 +464,7 @@
               <w:rPr>
                 <w:i/>
               </w:rPr>
-              <w:t>[Your Role, e.g., Lead Developer]</w:t>
+              <w:t>[Role, e.g., Project Manager]</w:t>
             </w:r>
           </w:p>
         </w:tc>
@@ -534,7 +475,7 @@
           <w:p>
             <w:pPr>
               <w:keepNext/>
-              <w:spacing w:before="240" w:after="120"/>
+              <w:spacing w:before="160" w:after="80"/>
               <w:pBdr>
                 <w:bottom w:val="single" w:sz="4" w:space="1" w:color="CCCCCC"/>
               </w:pBdr>
@@ -543,7 +484,7 @@
               <w:rPr>
                 <w:b/>
                 <w:color w:val="0B5694"/>
-                <w:sz w:val="25"/>
+                <w:sz w:val="22"/>
               </w:rPr>
               <w:t>Awards</w:t>
             </w:r>
@@ -551,7 +492,7 @@
           <w:p>
             <w:pPr>
               <w:pStyle w:val="ListBullet"/>
-              <w:spacing w:after="40"/>
+              <w:spacing w:after="20"/>
             </w:pPr>
             <w:r>
               <w:t>[Award Title 1 / Competition Name]</w:t>
@@ -560,7 +501,7 @@
           <w:p>
             <w:pPr>
               <w:pStyle w:val="ListBullet"/>
-              <w:spacing w:after="240"/>
+              <w:spacing w:after="160"/>
             </w:pPr>
             <w:r>
               <w:t>[Award Title 2 / Competition Name]</w:t>
@@ -569,7 +510,7 @@
           <w:p>
             <w:pPr>
               <w:keepNext/>
-              <w:spacing w:before="240" w:after="120"/>
+              <w:spacing w:before="160" w:after="80"/>
               <w:pBdr>
                 <w:bottom w:val="single" w:sz="4" w:space="1" w:color="CCCCCC"/>
               </w:pBdr>
@@ -578,7 +519,7 @@
               <w:rPr>
                 <w:b/>
                 <w:color w:val="0B5694"/>
-                <w:sz w:val="25"/>
+                <w:sz w:val="22"/>
               </w:rPr>
               <w:t>Certifications</w:t>
             </w:r>
@@ -586,7 +527,7 @@
           <w:p>
             <w:pPr>
               <w:pStyle w:val="ListBullet"/>
-              <w:spacing w:after="40"/>
+              <w:spacing w:after="20"/>
             </w:pPr>
             <w:r>
               <w:t>[Certification Title 1, e.g., Microsoft Certified]</w:t>
@@ -595,7 +536,7 @@
           <w:p>
             <w:pPr>
               <w:pStyle w:val="ListBullet"/>
-              <w:spacing w:after="240"/>
+              <w:spacing w:after="160"/>
             </w:pPr>
             <w:r>
               <w:t>[Certification Title 2]</w:t>
@@ -604,7 +545,7 @@
           <w:p>
             <w:pPr>
               <w:keepNext/>
-              <w:spacing w:before="240" w:after="120"/>
+              <w:spacing w:before="160" w:after="80"/>
               <w:pBdr>
                 <w:bottom w:val="single" w:sz="4" w:space="1" w:color="CCCCCC"/>
               </w:pBdr>
@@ -613,7 +554,7 @@
               <w:rPr>
                 <w:b/>
                 <w:color w:val="0B5694"/>
-                <w:sz w:val="25"/>
+                <w:sz w:val="22"/>
               </w:rPr>
               <w:t>Organizations</w:t>
             </w:r>
@@ -621,7 +562,7 @@
           <w:p>
             <w:pPr>
               <w:pStyle w:val="ListBullet"/>
-              <w:spacing w:after="40"/>
+              <w:spacing w:after="20"/>
             </w:pPr>
             <w:r>
               <w:rPr>
@@ -630,13 +571,13 @@
               <w:t>[Officer Position]</w:t>
             </w:r>
             <w:r>
-              <w:t>, [Organization Name] [Years]</w:t>
+              <w:t>, [Organization Name]</w:t>
             </w:r>
           </w:p>
           <w:p>
             <w:pPr>
               <w:pStyle w:val="ListBullet"/>
-              <w:spacing w:after="240"/>
+              <w:spacing w:after="160"/>
             </w:pPr>
             <w:r>
               <w:rPr>
@@ -645,13 +586,13 @@
               <w:t>Member</w:t>
             </w:r>
             <w:r>
-              <w:t>, [Organization Name] [Years]</w:t>
+              <w:t>, [Organization Name]</w:t>
             </w:r>
           </w:p>
           <w:p>
             <w:pPr>
               <w:keepNext/>
-              <w:spacing w:before="240" w:after="120"/>
+              <w:spacing w:before="160" w:after="80"/>
               <w:pBdr>
                 <w:bottom w:val="single" w:sz="4" w:space="1" w:color="CCCCCC"/>
               </w:pBdr>
@@ -660,7 +601,7 @@
               <w:rPr>
                 <w:b/>
                 <w:color w:val="0B5694"/>
-                <w:sz w:val="25"/>
+                <w:sz w:val="22"/>
               </w:rPr>
               <w:t>Languages Spoken</w:t>
             </w:r>
@@ -668,7 +609,7 @@
           <w:p>
             <w:pPr>
               <w:pStyle w:val="ListBullet"/>
-              <w:spacing w:after="40"/>
+              <w:spacing w:after="20"/>
             </w:pPr>
             <w:r>
               <w:t>Filipino</w:t>
@@ -677,7 +618,7 @@
           <w:p>
             <w:pPr>
               <w:pStyle w:val="ListBullet"/>
-              <w:spacing w:after="240"/>
+              <w:spacing w:after="160"/>
             </w:pPr>
             <w:r>
               <w:t>English</w:t>
@@ -686,7 +627,7 @@
           <w:p>
             <w:pPr>
               <w:keepNext/>
-              <w:spacing w:before="240" w:after="120"/>
+              <w:spacing w:before="160" w:after="80"/>
               <w:pBdr>
                 <w:bottom w:val="single" w:sz="4" w:space="1" w:color="CCCCCC"/>
               </w:pBdr>
@@ -695,7 +636,7 @@
               <w:rPr>
                 <w:b/>
                 <w:color w:val="0B5694"/>
-                <w:sz w:val="25"/>
+                <w:sz w:val="22"/>
               </w:rPr>
               <w:t>Other Interests</w:t>
             </w:r>
@@ -703,10 +644,10 @@
           <w:p>
             <w:pPr>
               <w:pStyle w:val="ListBullet"/>
-              <w:spacing w:after="40"/>
+              <w:spacing w:after="20"/>
             </w:pPr>
             <w:r>
-              <w:t>[Interest / Hobby 1, e.g., Vlogging]</w:t>
+              <w:t>[Hobby 1, e.g., Vlogging]</w:t>
             </w:r>
           </w:p>
           <w:p>
@@ -715,7 +656,7 @@
               <w:spacing w:after="0"/>
             </w:pPr>
             <w:r>
-              <w:t>[Interest / Hobby 2, e.g., Digital Painting]</w:t>
+              <w:t>[Hobby 2, e.g., Digital Painting]</w:t>
             </w:r>
           </w:p>
         </w:tc>
@@ -723,7 +664,7 @@
     </w:tbl>
     <w:sectPr>
       <w:pgSz w:w="12240" w:h="15840"/>
-      <w:pgMar w:top="864" w:right="864" w:bottom="864" w:left="864" w:header="720" w:footer="720" w:gutter="0"/>
+      <w:pgMar w:top="720" w:right="720" w:bottom="720" w:left="720" w:header="720" w:footer="720" w:gutter="0"/>
       <w:cols w:space="720"/>
       <w:docGrid w:linePitch="360"/>
     </w:sectPr>
@@ -1096,7 +1037,7 @@
     <w:rsid w:val="00FC693F"/>
     <w:rPr>
       <w:rFonts w:ascii="Arial" w:hAnsi="Arial"/>
-      <w:sz w:val="21"/>
+      <w:sz w:val="18"/>
     </w:rPr>
   </w:style>
   <w:style w:type="paragraph" w:styleId="Header">

</xml_diff>

<commit_message>
feat(onboarding): populate resume template with realistic dummy data and restore 10.5pt font readability
</commit_message>
<xml_diff>
--- a/public/templates/SmarTern_Student_Resume_Template.docx
+++ b/public/templates/SmarTern_Student_Resume_Template.docx
@@ -18,13 +18,13 @@
         </w:tblBorders>
       </w:tblPr>
       <w:tblGrid>
-        <w:gridCol w:w="1728"/>
-        <w:gridCol w:w="9072"/>
+        <w:gridCol w:w="1872"/>
+        <w:gridCol w:w="8640"/>
       </w:tblGrid>
       <w:tr>
         <w:tc>
           <w:tcPr>
-            <w:tcW w:type="dxa" w:w="1728"/>
+            <w:tcW w:type="dxa" w:w="1872"/>
             <w:tcBorders>
               <w:top w:val="single" w:sz="4" w:space="0" w:color="CCCCCC"/>
               <w:left w:val="single" w:sz="4" w:space="0" w:color="CCCCCC"/>
@@ -34,14 +34,14 @@
           </w:tcPr>
           <w:p>
             <w:pPr>
-              <w:spacing w:before="80" w:after="80"/>
+              <w:spacing w:before="160" w:after="160"/>
               <w:jc w:val="center"/>
             </w:pPr>
             <w:r>
               <w:rPr>
                 <w:b/>
                 <w:color w:val="787878"/>
-                <w:sz w:val="16"/>
+                <w:sz w:val="17"/>
               </w:rPr>
               <w:t>[ INSERT</w:t>
               <w:br/>
@@ -53,33 +53,35 @@
         </w:tc>
         <w:tc>
           <w:tcPr>
-            <w:tcW w:type="dxa" w:w="9072"/>
+            <w:tcW w:type="dxa" w:w="8640"/>
           </w:tcPr>
           <w:p>
             <w:pPr>
-              <w:spacing w:before="80" w:after="40"/>
-              <w:ind w:left="216"/>
+              <w:spacing w:before="120" w:after="40"/>
+              <w:ind w:left="288"/>
             </w:pPr>
             <w:r>
               <w:rPr>
                 <w:b/>
                 <w:color w:val="0B5694"/>
-                <w:sz w:val="32"/>
+                <w:sz w:val="36"/>
               </w:rPr>
-              <w:t>[YOUR FULL NAME]</w:t>
+              <w:t>JOHN DOE</w:t>
             </w:r>
           </w:p>
           <w:p>
             <w:pPr>
               <w:spacing w:before="0" w:after="0"/>
-              <w:ind w:left="216"/>
+              <w:ind w:left="288"/>
             </w:pPr>
             <w:r>
               <w:rPr>
                 <w:color w:val="505050"/>
-                <w:sz w:val="20"/>
+                <w:sz w:val="22"/>
               </w:rPr>
-              <w:t>[YOUR DEGREE / PROGRAM, e.g., Bachelor of Science in Information Technology]</w:t>
+              <w:t>Bachelor of Science in Information Technology</w:t>
+              <w:br/>
+              <w:t>Specialization in Web and Mobile Application</w:t>
             </w:r>
           </w:p>
         </w:tc>
@@ -87,7 +89,7 @@
     </w:tbl>
     <w:p>
       <w:pPr>
-        <w:spacing w:before="80" w:after="160"/>
+        <w:spacing w:before="120" w:after="200"/>
         <w:pBdr>
           <w:bottom w:val="single" w:sz="6" w:space="1" w:color="0B5694"/>
         </w:pBdr>
@@ -109,18 +111,18 @@
         </w:tblBorders>
       </w:tblPr>
       <w:tblGrid>
-        <w:gridCol w:w="6768"/>
+        <w:gridCol w:w="6480"/>
         <w:gridCol w:w="4032"/>
       </w:tblGrid>
       <w:tr>
         <w:tc>
           <w:tcPr>
-            <w:tcW w:type="dxa" w:w="6768"/>
+            <w:tcW w:type="dxa" w:w="6480"/>
           </w:tcPr>
           <w:p>
             <w:pPr>
               <w:keepNext/>
-              <w:spacing w:before="160" w:after="80"/>
+              <w:spacing w:before="200" w:after="80"/>
               <w:pBdr>
                 <w:bottom w:val="single" w:sz="4" w:space="1" w:color="CCCCCC"/>
               </w:pBdr>
@@ -129,14 +131,14 @@
               <w:rPr>
                 <w:b/>
                 <w:color w:val="0B5694"/>
-                <w:sz w:val="22"/>
+                <w:sz w:val="24"/>
               </w:rPr>
               <w:t>Contact Information</w:t>
             </w:r>
           </w:p>
           <w:p>
             <w:pPr>
-              <w:spacing w:after="20"/>
+              <w:spacing w:after="40"/>
             </w:pPr>
             <w:r>
               <w:rPr>
@@ -146,12 +148,12 @@
               <w:tab/>
             </w:r>
             <w:r>
-              <w:t>[CONTACT NUMBER, e.g., 09303044030]</w:t>
+              <w:t>09303044030</w:t>
             </w:r>
           </w:p>
           <w:p>
             <w:pPr>
-              <w:spacing w:after="20"/>
+              <w:spacing w:after="40"/>
             </w:pPr>
             <w:r>
               <w:rPr>
@@ -161,12 +163,12 @@
               <w:tab/>
             </w:r>
             <w:r>
-              <w:t>[EMAIL ADDRESS, e.g., student@emaildomain.com]</w:t>
+              <w:t>johndoe@emaildomain.com</w:t>
             </w:r>
           </w:p>
           <w:p>
             <w:pPr>
-              <w:spacing w:after="160"/>
+              <w:spacing w:after="200"/>
             </w:pPr>
             <w:r>
               <w:rPr>
@@ -176,13 +178,13 @@
               <w:tab/>
             </w:r>
             <w:r>
-              <w:t>[PHYSICAL ADDRESS, e.g., Quezon City, Metro Manila 1109]</w:t>
+              <w:t>Quezon City, Metro Manila, Philippines 1109</w:t>
             </w:r>
           </w:p>
           <w:p>
             <w:pPr>
               <w:keepNext/>
-              <w:spacing w:before="160" w:after="80"/>
+              <w:spacing w:before="200" w:after="80"/>
               <w:pBdr>
                 <w:bottom w:val="single" w:sz="4" w:space="1" w:color="CCCCCC"/>
               </w:pBdr>
@@ -191,58 +193,58 @@
               <w:rPr>
                 <w:b/>
                 <w:color w:val="0B5694"/>
-                <w:sz w:val="22"/>
+                <w:sz w:val="24"/>
               </w:rPr>
               <w:t>Education</w:t>
             </w:r>
           </w:p>
           <w:p>
             <w:pPr>
-              <w:spacing w:after="20"/>
+              <w:spacing w:after="40"/>
             </w:pPr>
             <w:r>
               <w:rPr>
                 <w:b/>
-                <w:sz w:val="19"/>
+                <w:sz w:val="20"/>
               </w:rPr>
-              <w:t>[DEGREE / PROGRAM DETAILS, e.g., BS in Information Technology]</w:t>
+              <w:t>BS in Information Technology (WMA)</w:t>
             </w:r>
           </w:p>
           <w:p>
             <w:pPr>
-              <w:spacing w:after="20"/>
+              <w:spacing w:after="40"/>
             </w:pPr>
             <w:r>
               <w:rPr>
                 <w:b/>
                 <w:color w:val="505050"/>
               </w:rPr>
-              <w:t>[YOUR UNIVERSITY / ACADEMIC INSTITUTION, e.g., FEU Institute of Technology]</w:t>
+              <w:t>FEU Institute of Technology</w:t>
             </w:r>
           </w:p>
           <w:p>
             <w:pPr>
-              <w:spacing w:after="20"/>
+              <w:spacing w:after="40"/>
             </w:pPr>
             <w:r>
-              <w:t>[CAMPUS LOCATION, e.g., P. Paredes St., Sampaloc, Manila]</w:t>
+              <w:t>P. Paredes St., Sampaloc, Manila</w:t>
             </w:r>
           </w:p>
           <w:p>
             <w:pPr>
-              <w:spacing w:after="160"/>
+              <w:spacing w:after="200"/>
             </w:pPr>
             <w:r>
               <w:rPr>
                 <w:i/>
               </w:rPr>
-              <w:t>Expected Graduation – [Year, e.g., 2025]</w:t>
+              <w:t>Expected Graduation – 2025</w:t>
             </w:r>
           </w:p>
           <w:p>
             <w:pPr>
               <w:keepNext/>
-              <w:spacing w:before="160" w:after="80"/>
+              <w:spacing w:before="200" w:after="80"/>
               <w:pBdr>
                 <w:bottom w:val="single" w:sz="4" w:space="1" w:color="CCCCCC"/>
               </w:pBdr>
@@ -251,71 +253,71 @@
               <w:rPr>
                 <w:b/>
                 <w:color w:val="0B5694"/>
-                <w:sz w:val="22"/>
+                <w:sz w:val="24"/>
               </w:rPr>
               <w:t>Work Experience (Optional)</w:t>
             </w:r>
           </w:p>
           <w:p>
             <w:pPr>
-              <w:spacing w:after="20"/>
+              <w:spacing w:after="40"/>
             </w:pPr>
             <w:r>
               <w:rPr>
                 <w:b/>
-                <w:sz w:val="19"/>
+                <w:sz w:val="20"/>
               </w:rPr>
-              <w:t>[Job Title / Position, e.g., Web Developer Intern]</w:t>
+              <w:t>Web Developer Intern</w:t>
             </w:r>
           </w:p>
           <w:p>
             <w:pPr>
-              <w:spacing w:after="20"/>
+              <w:spacing w:after="40"/>
             </w:pPr>
             <w:r>
               <w:rPr>
                 <w:b/>
                 <w:color w:val="505050"/>
               </w:rPr>
-              <w:t>[Company / Organization Name, e.g., Tech Solutions Inc.]</w:t>
+              <w:t>Tech Solutions Inc.</w:t>
             </w:r>
           </w:p>
           <w:p>
             <w:pPr>
-              <w:spacing w:after="20"/>
+              <w:spacing w:after="40"/>
             </w:pPr>
             <w:r>
               <w:rPr>
                 <w:i/>
               </w:rPr>
-              <w:t xml:space="preserve">[Inclusive Dates, e.g., June 2024 – August 2024] | </w:t>
+              <w:t xml:space="preserve">June 2024 – August 2024 | </w:t>
             </w:r>
             <w:r>
-              <w:t>[Location, e.g., Makati City]</w:t>
+              <w:t>Manila, Philippines</w:t>
             </w:r>
           </w:p>
           <w:p>
             <w:pPr>
               <w:pStyle w:val="ListBullet"/>
-              <w:spacing w:after="20"/>
+              <w:spacing w:after="40"/>
             </w:pPr>
             <w:r>
-              <w:t>[Describe responsibility/achievement, e.g., Developed responsive UI components using Alpine.js]</w:t>
+              <w:t>Developed responsive user interface components using Alpine.js and Tailwind CSS.</w:t>
             </w:r>
           </w:p>
           <w:p>
             <w:pPr>
               <w:pStyle w:val="ListBullet"/>
-              <w:spacing w:after="160"/>
+              <w:spacing w:after="200"/>
             </w:pPr>
             <w:r>
-              <w:t>[Describe another achievement, e.g., Integrated RESTful API endpoints with Laravel backend]</w:t>
+              <w:t>Collaborated with the backend engineering team to integrate RESTful API endpoints.</w:t>
             </w:r>
           </w:p>
           <w:p>
             <w:pPr>
               <w:keepNext/>
-              <w:spacing w:before="160" w:after="80"/>
+              <w:spacing w:before="200" w:after="80"/>
               <w:pBdr>
                 <w:bottom w:val="single" w:sz="4" w:space="1" w:color="CCCCCC"/>
               </w:pBdr>
@@ -324,7 +326,7 @@
               <w:rPr>
                 <w:b/>
                 <w:color w:val="0B5694"/>
-                <w:sz w:val="22"/>
+                <w:sz w:val="24"/>
               </w:rPr>
               <w:t>Key Skills / Proficiency</w:t>
             </w:r>
@@ -343,7 +345,7 @@
           <w:p>
             <w:pPr>
               <w:pStyle w:val="ListBullet"/>
-              <w:spacing w:after="20"/>
+              <w:spacing w:after="40"/>
             </w:pPr>
             <w:r>
               <w:rPr>
@@ -358,22 +360,22 @@
           <w:p>
             <w:pPr>
               <w:pStyle w:val="ListBullet"/>
-              <w:spacing w:after="20"/>
+              <w:spacing w:after="40"/>
             </w:pPr>
             <w:r>
               <w:rPr>
                 <w:b/>
               </w:rPr>
-              <w:t xml:space="preserve">Database &amp; Dev Tools | </w:t>
+              <w:t xml:space="preserve">Databases &amp; Cloud | </w:t>
             </w:r>
             <w:r>
-              <w:t>SQL, Git, Azure, AWS</w:t>
+              <w:t>SQL, MySQL, Git, Azure</w:t>
             </w:r>
           </w:p>
           <w:p>
             <w:pPr>
               <w:pStyle w:val="ListBullet"/>
-              <w:spacing w:after="40"/>
+              <w:spacing w:after="80"/>
             </w:pPr>
             <w:r>
               <w:t>UI/UX Design &amp; Prototyping (Figma)</w:t>
@@ -393,7 +395,7 @@
           <w:p>
             <w:pPr>
               <w:pStyle w:val="ListBullet"/>
-              <w:spacing w:after="20"/>
+              <w:spacing w:after="40"/>
             </w:pPr>
             <w:r>
               <w:t>Oral and written communication</w:t>
@@ -402,7 +404,7 @@
           <w:p>
             <w:pPr>
               <w:pStyle w:val="ListBullet"/>
-              <w:spacing w:after="160"/>
+              <w:spacing w:after="200"/>
             </w:pPr>
             <w:r>
               <w:t>Teamwork &amp; Collaboration</w:t>
@@ -411,7 +413,7 @@
           <w:p>
             <w:pPr>
               <w:keepNext/>
-              <w:spacing w:before="160" w:after="80"/>
+              <w:spacing w:before="200" w:after="80"/>
               <w:pBdr>
                 <w:bottom w:val="single" w:sz="4" w:space="1" w:color="CCCCCC"/>
               </w:pBdr>
@@ -420,30 +422,9 @@
               <w:rPr>
                 <w:b/>
                 <w:color w:val="0B5694"/>
-                <w:sz w:val="22"/>
+                <w:sz w:val="24"/>
               </w:rPr>
               <w:t>Accomplished Projects / Engagements</w:t>
-            </w:r>
-          </w:p>
-          <w:p>
-            <w:pPr>
-              <w:pStyle w:val="ListBullet"/>
-              <w:spacing w:after="60"/>
-            </w:pPr>
-            <w:r>
-              <w:rPr>
-                <w:b/>
-              </w:rPr>
-              <w:t>[Project Title 1]</w:t>
-            </w:r>
-            <w:r>
-              <w:t xml:space="preserve"> : [Description of web/mobile system project] | </w:t>
-            </w:r>
-            <w:r>
-              <w:rPr>
-                <w:i/>
-              </w:rPr>
-              <w:t>[Role, e.g., Lead Developer]</w:t>
             </w:r>
           </w:p>
           <w:p>
@@ -455,16 +436,16 @@
               <w:rPr>
                 <w:b/>
               </w:rPr>
-              <w:t>[Project Title 2]</w:t>
+              <w:t>Auto-Axis</w:t>
             </w:r>
             <w:r>
-              <w:t xml:space="preserve"> : [Description of programming course project] | </w:t>
+              <w:t xml:space="preserve"> : A Web Auto Repair Shop Management System and a Mobile Proximity Geolocation Services | </w:t>
             </w:r>
             <w:r>
               <w:rPr>
                 <w:i/>
               </w:rPr>
-              <w:t>[Role, e.g., Project Manager]</w:t>
+              <w:t>Project Manager</w:t>
             </w:r>
           </w:p>
         </w:tc>
@@ -475,7 +456,7 @@
           <w:p>
             <w:pPr>
               <w:keepNext/>
-              <w:spacing w:before="160" w:after="80"/>
+              <w:spacing w:before="200" w:after="80"/>
               <w:pBdr>
                 <w:bottom w:val="single" w:sz="4" w:space="1" w:color="CCCCCC"/>
               </w:pBdr>
@@ -484,7 +465,7 @@
               <w:rPr>
                 <w:b/>
                 <w:color w:val="0B5694"/>
-                <w:sz w:val="22"/>
+                <w:sz w:val="24"/>
               </w:rPr>
               <w:t>Awards</w:t>
             </w:r>
@@ -492,25 +473,25 @@
           <w:p>
             <w:pPr>
               <w:pStyle w:val="ListBullet"/>
-              <w:spacing w:after="20"/>
+              <w:spacing w:after="40"/>
             </w:pPr>
             <w:r>
-              <w:t>[Award Title 1 / Competition Name]</w:t>
+              <w:t>Champion, IT Quiz Bee 2024</w:t>
             </w:r>
           </w:p>
           <w:p>
             <w:pPr>
               <w:pStyle w:val="ListBullet"/>
-              <w:spacing w:after="160"/>
+              <w:spacing w:after="200"/>
             </w:pPr>
             <w:r>
-              <w:t>[Award Title 2 / Competition Name]</w:t>
+              <w:t>Runner Up, HEALTHhack 2024</w:t>
             </w:r>
           </w:p>
           <w:p>
             <w:pPr>
               <w:keepNext/>
-              <w:spacing w:before="160" w:after="80"/>
+              <w:spacing w:before="200" w:after="80"/>
               <w:pBdr>
                 <w:bottom w:val="single" w:sz="4" w:space="1" w:color="CCCCCC"/>
               </w:pBdr>
@@ -519,7 +500,7 @@
               <w:rPr>
                 <w:b/>
                 <w:color w:val="0B5694"/>
-                <w:sz w:val="22"/>
+                <w:sz w:val="24"/>
               </w:rPr>
               <w:t>Certifications</w:t>
             </w:r>
@@ -527,25 +508,25 @@
           <w:p>
             <w:pPr>
               <w:pStyle w:val="ListBullet"/>
-              <w:spacing w:after="20"/>
+              <w:spacing w:after="40"/>
             </w:pPr>
             <w:r>
-              <w:t>[Certification Title 1, e.g., Microsoft Certified]</w:t>
+              <w:t>Autodesk® Certified User: Maya®</w:t>
             </w:r>
           </w:p>
           <w:p>
             <w:pPr>
               <w:pStyle w:val="ListBullet"/>
-              <w:spacing w:after="160"/>
+              <w:spacing w:after="200"/>
             </w:pPr>
             <w:r>
-              <w:t>[Certification Title 2]</w:t>
+              <w:t>Microsoft® Certified Professional</w:t>
             </w:r>
           </w:p>
           <w:p>
             <w:pPr>
               <w:keepNext/>
-              <w:spacing w:before="160" w:after="80"/>
+              <w:spacing w:before="200" w:after="80"/>
               <w:pBdr>
                 <w:bottom w:val="single" w:sz="4" w:space="1" w:color="CCCCCC"/>
               </w:pBdr>
@@ -554,7 +535,7 @@
               <w:rPr>
                 <w:b/>
                 <w:color w:val="0B5694"/>
-                <w:sz w:val="22"/>
+                <w:sz w:val="24"/>
               </w:rPr>
               <w:t>Organizations</w:t>
             </w:r>
@@ -562,22 +543,22 @@
           <w:p>
             <w:pPr>
               <w:pStyle w:val="ListBullet"/>
-              <w:spacing w:after="20"/>
+              <w:spacing w:after="40"/>
             </w:pPr>
             <w:r>
               <w:rPr>
                 <w:b/>
               </w:rPr>
-              <w:t>[Officer Position]</w:t>
+              <w:t>Treasurer</w:t>
             </w:r>
             <w:r>
-              <w:t>, [Organization Name]</w:t>
+              <w:t>, Theater Guild, Artist Connection</w:t>
             </w:r>
           </w:p>
           <w:p>
             <w:pPr>
               <w:pStyle w:val="ListBullet"/>
-              <w:spacing w:after="160"/>
+              <w:spacing w:after="200"/>
             </w:pPr>
             <w:r>
               <w:rPr>
@@ -586,13 +567,13 @@
               <w:t>Member</w:t>
             </w:r>
             <w:r>
-              <w:t>, [Organization Name]</w:t>
+              <w:t>, Alliance of Information Technology Students</w:t>
             </w:r>
           </w:p>
           <w:p>
             <w:pPr>
               <w:keepNext/>
-              <w:spacing w:before="160" w:after="80"/>
+              <w:spacing w:before="200" w:after="80"/>
               <w:pBdr>
                 <w:bottom w:val="single" w:sz="4" w:space="1" w:color="CCCCCC"/>
               </w:pBdr>
@@ -601,7 +582,7 @@
               <w:rPr>
                 <w:b/>
                 <w:color w:val="0B5694"/>
-                <w:sz w:val="22"/>
+                <w:sz w:val="24"/>
               </w:rPr>
               <w:t>Languages Spoken</w:t>
             </w:r>
@@ -609,7 +590,7 @@
           <w:p>
             <w:pPr>
               <w:pStyle w:val="ListBullet"/>
-              <w:spacing w:after="20"/>
+              <w:spacing w:after="40"/>
             </w:pPr>
             <w:r>
               <w:t>Filipino</w:t>
@@ -618,7 +599,7 @@
           <w:p>
             <w:pPr>
               <w:pStyle w:val="ListBullet"/>
-              <w:spacing w:after="160"/>
+              <w:spacing w:after="200"/>
             </w:pPr>
             <w:r>
               <w:t>English</w:t>
@@ -627,7 +608,7 @@
           <w:p>
             <w:pPr>
               <w:keepNext/>
-              <w:spacing w:before="160" w:after="80"/>
+              <w:spacing w:before="200" w:after="80"/>
               <w:pBdr>
                 <w:bottom w:val="single" w:sz="4" w:space="1" w:color="CCCCCC"/>
               </w:pBdr>
@@ -636,7 +617,7 @@
               <w:rPr>
                 <w:b/>
                 <w:color w:val="0B5694"/>
-                <w:sz w:val="22"/>
+                <w:sz w:val="24"/>
               </w:rPr>
               <w:t>Other Interests</w:t>
             </w:r>
@@ -644,10 +625,10 @@
           <w:p>
             <w:pPr>
               <w:pStyle w:val="ListBullet"/>
-              <w:spacing w:after="20"/>
+              <w:spacing w:after="40"/>
             </w:pPr>
             <w:r>
-              <w:t>[Hobby 1, e.g., Vlogging]</w:t>
+              <w:t>Vlogging</w:t>
             </w:r>
           </w:p>
           <w:p>
@@ -656,7 +637,7 @@
               <w:spacing w:after="0"/>
             </w:pPr>
             <w:r>
-              <w:t>[Hobby 2, e.g., Digital Painting]</w:t>
+              <w:t>Digital Painting</w:t>
             </w:r>
           </w:p>
         </w:tc>
@@ -664,7 +645,7 @@
     </w:tbl>
     <w:sectPr>
       <w:pgSz w:w="12240" w:h="15840"/>
-      <w:pgMar w:top="720" w:right="720" w:bottom="720" w:left="720" w:header="720" w:footer="720" w:gutter="0"/>
+      <w:pgMar w:top="864" w:right="864" w:bottom="864" w:left="864" w:header="720" w:footer="720" w:gutter="0"/>
       <w:cols w:space="720"/>
       <w:docGrid w:linePitch="360"/>
     </w:sectPr>
@@ -1037,7 +1018,7 @@
     <w:rsid w:val="00FC693F"/>
     <w:rPr>
       <w:rFonts w:ascii="Arial" w:hAnsi="Arial"/>
-      <w:sz w:val="18"/>
+      <w:sz w:val="21"/>
     </w:rPr>
   </w:style>
   <w:style w:type="paragraph" w:styleId="Header">

</xml_diff>

<commit_message>
feat(onboarding): increase resume template font size to 12pt and remove optional experience suffix
</commit_message>
<xml_diff>
--- a/public/templates/SmarTern_Student_Resume_Template.docx
+++ b/public/templates/SmarTern_Student_Resume_Template.docx
@@ -34,14 +34,14 @@
           </w:tcPr>
           <w:p>
             <w:pPr>
-              <w:spacing w:before="160" w:after="160"/>
+              <w:spacing w:before="80" w:after="80"/>
               <w:jc w:val="center"/>
             </w:pPr>
             <w:r>
               <w:rPr>
                 <w:b/>
                 <w:color w:val="787878"/>
-                <w:sz w:val="17"/>
+                <w:sz w:val="18"/>
               </w:rPr>
               <w:t>[ INSERT</w:t>
               <w:br/>
@@ -57,14 +57,14 @@
           </w:tcPr>
           <w:p>
             <w:pPr>
-              <w:spacing w:before="120" w:after="40"/>
+              <w:spacing w:before="80" w:after="40"/>
               <w:ind w:left="288"/>
             </w:pPr>
             <w:r>
               <w:rPr>
                 <w:b/>
                 <w:color w:val="0B5694"/>
-                <w:sz w:val="36"/>
+                <w:sz w:val="40"/>
               </w:rPr>
               <w:t>JOHN DOE</w:t>
             </w:r>
@@ -77,7 +77,7 @@
             <w:r>
               <w:rPr>
                 <w:color w:val="505050"/>
-                <w:sz w:val="22"/>
+                <w:sz w:val="24"/>
               </w:rPr>
               <w:t>Bachelor of Science in Information Technology</w:t>
               <w:br/>
@@ -89,7 +89,7 @@
     </w:tbl>
     <w:p>
       <w:pPr>
-        <w:spacing w:before="120" w:after="200"/>
+        <w:spacing w:before="80" w:after="160"/>
         <w:pBdr>
           <w:bottom w:val="single" w:sz="6" w:space="1" w:color="0B5694"/>
         </w:pBdr>
@@ -122,7 +122,7 @@
           <w:p>
             <w:pPr>
               <w:keepNext/>
-              <w:spacing w:before="200" w:after="80"/>
+              <w:spacing w:before="160" w:after="60"/>
               <w:pBdr>
                 <w:bottom w:val="single" w:sz="4" w:space="1" w:color="CCCCCC"/>
               </w:pBdr>
@@ -131,7 +131,7 @@
               <w:rPr>
                 <w:b/>
                 <w:color w:val="0B5694"/>
-                <w:sz w:val="24"/>
+                <w:sz w:val="26"/>
               </w:rPr>
               <w:t>Contact Information</w:t>
             </w:r>
@@ -144,8 +144,7 @@
               <w:rPr>
                 <w:b/>
               </w:rPr>
-              <w:t>Phone:</w:t>
-              <w:tab/>
+              <w:t xml:space="preserve">Phone: </w:t>
             </w:r>
             <w:r>
               <w:t>09303044030</w:t>
@@ -159,8 +158,7 @@
               <w:rPr>
                 <w:b/>
               </w:rPr>
-              <w:t>Email:</w:t>
-              <w:tab/>
+              <w:t xml:space="preserve">Email: </w:t>
             </w:r>
             <w:r>
               <w:t>johndoe@emaildomain.com</w:t>
@@ -168,14 +166,13 @@
           </w:p>
           <w:p>
             <w:pPr>
-              <w:spacing w:after="200"/>
+              <w:spacing w:after="120"/>
             </w:pPr>
             <w:r>
               <w:rPr>
                 <w:b/>
               </w:rPr>
-              <w:t>Address:</w:t>
-              <w:tab/>
+              <w:t xml:space="preserve">Address: </w:t>
             </w:r>
             <w:r>
               <w:t>Quezon City, Metro Manila, Philippines 1109</w:t>
@@ -184,7 +181,7 @@
           <w:p>
             <w:pPr>
               <w:keepNext/>
-              <w:spacing w:before="200" w:after="80"/>
+              <w:spacing w:before="160" w:after="60"/>
               <w:pBdr>
                 <w:bottom w:val="single" w:sz="4" w:space="1" w:color="CCCCCC"/>
               </w:pBdr>
@@ -193,7 +190,7 @@
               <w:rPr>
                 <w:b/>
                 <w:color w:val="0B5694"/>
-                <w:sz w:val="24"/>
+                <w:sz w:val="26"/>
               </w:rPr>
               <w:t>Education</w:t>
             </w:r>
@@ -205,7 +202,6 @@
             <w:r>
               <w:rPr>
                 <w:b/>
-                <w:sz w:val="20"/>
               </w:rPr>
               <w:t>BS in Information Technology (WMA)</w:t>
             </w:r>
@@ -232,7 +228,7 @@
           </w:p>
           <w:p>
             <w:pPr>
-              <w:spacing w:after="200"/>
+              <w:spacing w:after="120"/>
             </w:pPr>
             <w:r>
               <w:rPr>
@@ -244,7 +240,7 @@
           <w:p>
             <w:pPr>
               <w:keepNext/>
-              <w:spacing w:before="200" w:after="80"/>
+              <w:spacing w:before="160" w:after="60"/>
               <w:pBdr>
                 <w:bottom w:val="single" w:sz="4" w:space="1" w:color="CCCCCC"/>
               </w:pBdr>
@@ -253,9 +249,9 @@
               <w:rPr>
                 <w:b/>
                 <w:color w:val="0B5694"/>
-                <w:sz w:val="24"/>
+                <w:sz w:val="26"/>
               </w:rPr>
-              <w:t>Work Experience (Optional)</w:t>
+              <w:t>Work Experience</w:t>
             </w:r>
           </w:p>
           <w:p>
@@ -265,7 +261,6 @@
             <w:r>
               <w:rPr>
                 <w:b/>
-                <w:sz w:val="20"/>
               </w:rPr>
               <w:t>Web Developer Intern</w:t>
             </w:r>
@@ -308,7 +303,7 @@
           <w:p>
             <w:pPr>
               <w:pStyle w:val="ListBullet"/>
-              <w:spacing w:after="200"/>
+              <w:spacing w:after="120"/>
             </w:pPr>
             <w:r>
               <w:t>Collaborated with the backend engineering team to integrate RESTful API endpoints.</w:t>
@@ -317,7 +312,7 @@
           <w:p>
             <w:pPr>
               <w:keepNext/>
-              <w:spacing w:before="200" w:after="80"/>
+              <w:spacing w:before="160" w:after="60"/>
               <w:pBdr>
                 <w:bottom w:val="single" w:sz="4" w:space="1" w:color="CCCCCC"/>
               </w:pBdr>
@@ -326,7 +321,7 @@
               <w:rPr>
                 <w:b/>
                 <w:color w:val="0B5694"/>
-                <w:sz w:val="24"/>
+                <w:sz w:val="26"/>
               </w:rPr>
               <w:t>Key Skills / Proficiency</w:t>
             </w:r>
@@ -345,7 +340,7 @@
           <w:p>
             <w:pPr>
               <w:pStyle w:val="ListBullet"/>
-              <w:spacing w:after="40"/>
+              <w:spacing w:after="20"/>
             </w:pPr>
             <w:r>
               <w:rPr>
@@ -354,13 +349,13 @@
               <w:t xml:space="preserve">Programming Languages | </w:t>
             </w:r>
             <w:r>
-              <w:t>HTML, JavaScript, Kotlin, PHP, Python</w:t>
+              <w:t>HTML, JavaScript, Kotlin, PHP</w:t>
             </w:r>
           </w:p>
           <w:p>
             <w:pPr>
               <w:pStyle w:val="ListBullet"/>
-              <w:spacing w:after="40"/>
+              <w:spacing w:after="20"/>
             </w:pPr>
             <w:r>
               <w:rPr>
@@ -375,7 +370,7 @@
           <w:p>
             <w:pPr>
               <w:pStyle w:val="ListBullet"/>
-              <w:spacing w:after="80"/>
+              <w:spacing w:after="60"/>
             </w:pPr>
             <w:r>
               <w:t>UI/UX Design &amp; Prototyping (Figma)</w:t>
@@ -395,7 +390,7 @@
           <w:p>
             <w:pPr>
               <w:pStyle w:val="ListBullet"/>
-              <w:spacing w:after="40"/>
+              <w:spacing w:after="20"/>
             </w:pPr>
             <w:r>
               <w:t>Oral and written communication</w:t>
@@ -404,7 +399,7 @@
           <w:p>
             <w:pPr>
               <w:pStyle w:val="ListBullet"/>
-              <w:spacing w:after="200"/>
+              <w:spacing w:after="120"/>
             </w:pPr>
             <w:r>
               <w:t>Teamwork &amp; Collaboration</w:t>
@@ -413,7 +408,7 @@
           <w:p>
             <w:pPr>
               <w:keepNext/>
-              <w:spacing w:before="200" w:after="80"/>
+              <w:spacing w:before="160" w:after="60"/>
               <w:pBdr>
                 <w:bottom w:val="single" w:sz="4" w:space="1" w:color="CCCCCC"/>
               </w:pBdr>
@@ -422,9 +417,9 @@
               <w:rPr>
                 <w:b/>
                 <w:color w:val="0B5694"/>
-                <w:sz w:val="24"/>
+                <w:sz w:val="26"/>
               </w:rPr>
-              <w:t>Accomplished Projects / Engagements</w:t>
+              <w:t>Accomplished Projects</w:t>
             </w:r>
           </w:p>
           <w:p>
@@ -439,7 +434,7 @@
               <w:t>Auto-Axis</w:t>
             </w:r>
             <w:r>
-              <w:t xml:space="preserve"> : A Web Auto Repair Shop Management System and a Mobile Proximity Geolocation Services | </w:t>
+              <w:t xml:space="preserve"> : A Web Auto Repair Shop Management System | </w:t>
             </w:r>
             <w:r>
               <w:rPr>
@@ -456,7 +451,7 @@
           <w:p>
             <w:pPr>
               <w:keepNext/>
-              <w:spacing w:before="200" w:after="80"/>
+              <w:spacing w:before="160" w:after="60"/>
               <w:pBdr>
                 <w:bottom w:val="single" w:sz="4" w:space="1" w:color="CCCCCC"/>
               </w:pBdr>
@@ -465,7 +460,7 @@
               <w:rPr>
                 <w:b/>
                 <w:color w:val="0B5694"/>
-                <w:sz w:val="24"/>
+                <w:sz w:val="26"/>
               </w:rPr>
               <w:t>Awards</w:t>
             </w:r>
@@ -473,7 +468,7 @@
           <w:p>
             <w:pPr>
               <w:pStyle w:val="ListBullet"/>
-              <w:spacing w:after="40"/>
+              <w:spacing w:after="20"/>
             </w:pPr>
             <w:r>
               <w:t>Champion, IT Quiz Bee 2024</w:t>
@@ -482,7 +477,7 @@
           <w:p>
             <w:pPr>
               <w:pStyle w:val="ListBullet"/>
-              <w:spacing w:after="200"/>
+              <w:spacing w:after="120"/>
             </w:pPr>
             <w:r>
               <w:t>Runner Up, HEALTHhack 2024</w:t>
@@ -491,7 +486,7 @@
           <w:p>
             <w:pPr>
               <w:keepNext/>
-              <w:spacing w:before="200" w:after="80"/>
+              <w:spacing w:before="160" w:after="60"/>
               <w:pBdr>
                 <w:bottom w:val="single" w:sz="4" w:space="1" w:color="CCCCCC"/>
               </w:pBdr>
@@ -500,7 +495,7 @@
               <w:rPr>
                 <w:b/>
                 <w:color w:val="0B5694"/>
-                <w:sz w:val="24"/>
+                <w:sz w:val="26"/>
               </w:rPr>
               <w:t>Certifications</w:t>
             </w:r>
@@ -508,7 +503,7 @@
           <w:p>
             <w:pPr>
               <w:pStyle w:val="ListBullet"/>
-              <w:spacing w:after="40"/>
+              <w:spacing w:after="20"/>
             </w:pPr>
             <w:r>
               <w:t>Autodesk® Certified User: Maya®</w:t>
@@ -517,7 +512,7 @@
           <w:p>
             <w:pPr>
               <w:pStyle w:val="ListBullet"/>
-              <w:spacing w:after="200"/>
+              <w:spacing w:after="120"/>
             </w:pPr>
             <w:r>
               <w:t>Microsoft® Certified Professional</w:t>
@@ -526,7 +521,7 @@
           <w:p>
             <w:pPr>
               <w:keepNext/>
-              <w:spacing w:before="200" w:after="80"/>
+              <w:spacing w:before="160" w:after="60"/>
               <w:pBdr>
                 <w:bottom w:val="single" w:sz="4" w:space="1" w:color="CCCCCC"/>
               </w:pBdr>
@@ -535,7 +530,7 @@
               <w:rPr>
                 <w:b/>
                 <w:color w:val="0B5694"/>
-                <w:sz w:val="24"/>
+                <w:sz w:val="26"/>
               </w:rPr>
               <w:t>Organizations</w:t>
             </w:r>
@@ -543,7 +538,7 @@
           <w:p>
             <w:pPr>
               <w:pStyle w:val="ListBullet"/>
-              <w:spacing w:after="40"/>
+              <w:spacing w:after="20"/>
             </w:pPr>
             <w:r>
               <w:rPr>
@@ -552,13 +547,13 @@
               <w:t>Treasurer</w:t>
             </w:r>
             <w:r>
-              <w:t>, Theater Guild, Artist Connection</w:t>
+              <w:t>, Theater Guild</w:t>
             </w:r>
           </w:p>
           <w:p>
             <w:pPr>
               <w:pStyle w:val="ListBullet"/>
-              <w:spacing w:after="200"/>
+              <w:spacing w:after="120"/>
             </w:pPr>
             <w:r>
               <w:rPr>
@@ -567,13 +562,13 @@
               <w:t>Member</w:t>
             </w:r>
             <w:r>
-              <w:t>, Alliance of Information Technology Students</w:t>
+              <w:t>, Alliance of IT Students</w:t>
             </w:r>
           </w:p>
           <w:p>
             <w:pPr>
               <w:keepNext/>
-              <w:spacing w:before="200" w:after="80"/>
+              <w:spacing w:before="160" w:after="60"/>
               <w:pBdr>
                 <w:bottom w:val="single" w:sz="4" w:space="1" w:color="CCCCCC"/>
               </w:pBdr>
@@ -582,7 +577,7 @@
               <w:rPr>
                 <w:b/>
                 <w:color w:val="0B5694"/>
-                <w:sz w:val="24"/>
+                <w:sz w:val="26"/>
               </w:rPr>
               <w:t>Languages Spoken</w:t>
             </w:r>
@@ -590,7 +585,7 @@
           <w:p>
             <w:pPr>
               <w:pStyle w:val="ListBullet"/>
-              <w:spacing w:after="40"/>
+              <w:spacing w:after="20"/>
             </w:pPr>
             <w:r>
               <w:t>Filipino</w:t>
@@ -599,7 +594,7 @@
           <w:p>
             <w:pPr>
               <w:pStyle w:val="ListBullet"/>
-              <w:spacing w:after="200"/>
+              <w:spacing w:after="120"/>
             </w:pPr>
             <w:r>
               <w:t>English</w:t>
@@ -608,7 +603,7 @@
           <w:p>
             <w:pPr>
               <w:keepNext/>
-              <w:spacing w:before="200" w:after="80"/>
+              <w:spacing w:before="160" w:after="60"/>
               <w:pBdr>
                 <w:bottom w:val="single" w:sz="4" w:space="1" w:color="CCCCCC"/>
               </w:pBdr>
@@ -617,7 +612,7 @@
               <w:rPr>
                 <w:b/>
                 <w:color w:val="0B5694"/>
-                <w:sz w:val="24"/>
+                <w:sz w:val="26"/>
               </w:rPr>
               <w:t>Other Interests</w:t>
             </w:r>
@@ -625,7 +620,7 @@
           <w:p>
             <w:pPr>
               <w:pStyle w:val="ListBullet"/>
-              <w:spacing w:after="40"/>
+              <w:spacing w:after="20"/>
             </w:pPr>
             <w:r>
               <w:t>Vlogging</w:t>
@@ -1018,7 +1013,7 @@
     <w:rsid w:val="00FC693F"/>
     <w:rPr>
       <w:rFonts w:ascii="Arial" w:hAnsi="Arial"/>
-      <w:sz w:val="21"/>
+      <w:sz w:val="24"/>
     </w:rPr>
   </w:style>
   <w:style w:type="paragraph" w:styleId="Header">

</xml_diff>

<commit_message>
style(onboarding): remove bullet points from non-experience and non-project resume template sections
</commit_message>
<xml_diff>
--- a/public/templates/SmarTern_Student_Resume_Template.docx
+++ b/public/templates/SmarTern_Student_Resume_Template.docx
@@ -339,7 +339,6 @@
           </w:p>
           <w:p>
             <w:pPr>
-              <w:pStyle w:val="ListBullet"/>
               <w:spacing w:after="20"/>
             </w:pPr>
             <w:r>
@@ -354,7 +353,6 @@
           </w:p>
           <w:p>
             <w:pPr>
-              <w:pStyle w:val="ListBullet"/>
               <w:spacing w:after="20"/>
             </w:pPr>
             <w:r>
@@ -369,7 +367,6 @@
           </w:p>
           <w:p>
             <w:pPr>
-              <w:pStyle w:val="ListBullet"/>
               <w:spacing w:after="60"/>
             </w:pPr>
             <w:r>
@@ -389,7 +386,6 @@
           </w:p>
           <w:p>
             <w:pPr>
-              <w:pStyle w:val="ListBullet"/>
               <w:spacing w:after="20"/>
             </w:pPr>
             <w:r>
@@ -398,7 +394,6 @@
           </w:p>
           <w:p>
             <w:pPr>
-              <w:pStyle w:val="ListBullet"/>
               <w:spacing w:after="120"/>
             </w:pPr>
             <w:r>
@@ -467,7 +462,6 @@
           </w:p>
           <w:p>
             <w:pPr>
-              <w:pStyle w:val="ListBullet"/>
               <w:spacing w:after="20"/>
             </w:pPr>
             <w:r>
@@ -476,7 +470,6 @@
           </w:p>
           <w:p>
             <w:pPr>
-              <w:pStyle w:val="ListBullet"/>
               <w:spacing w:after="120"/>
             </w:pPr>
             <w:r>
@@ -502,7 +495,6 @@
           </w:p>
           <w:p>
             <w:pPr>
-              <w:pStyle w:val="ListBullet"/>
               <w:spacing w:after="20"/>
             </w:pPr>
             <w:r>
@@ -511,7 +503,6 @@
           </w:p>
           <w:p>
             <w:pPr>
-              <w:pStyle w:val="ListBullet"/>
               <w:spacing w:after="120"/>
             </w:pPr>
             <w:r>
@@ -537,7 +528,6 @@
           </w:p>
           <w:p>
             <w:pPr>
-              <w:pStyle w:val="ListBullet"/>
               <w:spacing w:after="20"/>
             </w:pPr>
             <w:r>
@@ -552,7 +542,6 @@
           </w:p>
           <w:p>
             <w:pPr>
-              <w:pStyle w:val="ListBullet"/>
               <w:spacing w:after="120"/>
             </w:pPr>
             <w:r>
@@ -584,7 +573,6 @@
           </w:p>
           <w:p>
             <w:pPr>
-              <w:pStyle w:val="ListBullet"/>
               <w:spacing w:after="20"/>
             </w:pPr>
             <w:r>
@@ -593,7 +581,6 @@
           </w:p>
           <w:p>
             <w:pPr>
-              <w:pStyle w:val="ListBullet"/>
               <w:spacing w:after="120"/>
             </w:pPr>
             <w:r>
@@ -619,7 +606,6 @@
           </w:p>
           <w:p>
             <w:pPr>
-              <w:pStyle w:val="ListBullet"/>
               <w:spacing w:after="20"/>
             </w:pPr>
             <w:r>
@@ -628,7 +614,6 @@
           </w:p>
           <w:p>
             <w:pPr>
-              <w:pStyle w:val="ListBullet"/>
               <w:spacing w:after="0"/>
             </w:pPr>
             <w:r>

</xml_diff>